<commit_message>
docs(mod02): agregar imagenes de diagramas de casos de uso, actividad, secuencia y ERD en documentos Word y Markdown
</commit_message>
<xml_diff>
--- a/src/02_Modulos/Intranet.Modulo02/Docs/01_DOCUMENTO_PRODUCTO_Y_HISTORIAS_USUARIO_PM.docx
+++ b/src/02_Modulos/Intranet.Modulo02/Docs/01_DOCUMENTO_PRODUCTO_Y_HISTORIAS_USUARIO_PM.docx
@@ -10,13 +10,13 @@
         <w:tblLook w:firstColumn="1" w:firstRow="1" w:lastColumn="0" w:lastRow="0" w:noHBand="0" w:noVBand="1" w:val="04A0"/>
       </w:tblPr>
       <w:tblGrid>
-        <w:gridCol w:w="9936"/>
+        <w:gridCol w:w="10080"/>
       </w:tblGrid>
       <w:tr>
         <w:tc>
           <w:tcPr>
-            <w:tcW w:type="dxa" w:w="9936"/>
-            <w:shd w:fill="1E293B"/>
+            <w:tcW w:type="dxa" w:w="10080"/>
+            <w:shd w:fill="0F172A"/>
             <w:tcMar>
               <w:top w:w="240" w:type="dxa"/>
               <w:bottom w:w="240" w:type="dxa"/>
@@ -32,7 +32,7 @@
               <w:rPr>
                 <w:rFonts w:ascii="Calibri" w:hAnsi="Calibri"/>
                 <w:b/>
-                <w:color w:val="94A3B8"/>
+                <w:color w:val="38BDF8"/>
                 <w:sz w:val="19"/>
               </w:rPr>
               <w:t>🏛️ IESTP "ARGENTINA" • INTRANET INSTITUCIONAL MODULAR</w:t>
@@ -47,9 +47,9 @@
                 <w:rFonts w:ascii="Calibri" w:hAnsi="Calibri"/>
                 <w:b/>
                 <w:color w:val="FFFFFF"/>
-                <w:sz w:val="32"/>
+                <w:sz w:val="30"/>
               </w:rPr>
-              <w:t>Especificación de Producto (PRD) &amp; Historias de Usuario (v3.0)</w:t>
+              <w:t>Especificación de Producto (PRD) &amp; Historias de Usuario (v3.5)</w:t>
             </w:r>
           </w:p>
           <w:p>
@@ -60,8 +60,8 @@
               <w:rPr>
                 <w:rFonts w:ascii="Calibri" w:hAnsi="Calibri"/>
                 <w:i/>
-                <w:color w:val="38BDF8"/>
-                <w:sz w:val="22"/>
+                <w:color w:val="94A3B8"/>
+                <w:sz w:val="21"/>
               </w:rPr>
               <w:t>Módulo 02: Control de Asistencia, Rediseño 'Excel-Killer' y Prevención DPI</w:t>
             </w:r>
@@ -74,9 +74,9 @@
               <w:rPr>
                 <w:rFonts w:ascii="Calibri" w:hAnsi="Calibri"/>
                 <w:color w:val="CBD5E1"/>
-                <w:sz w:val="18"/>
+                <w:sz w:val="17"/>
               </w:rPr>
-              <w:t>Para: Product Manager (PM) &amp; Dirección • Autor: Felipe (Equipo 02) • Triple Experiencia Docente</w:t>
+              <w:t>Para: Product Manager (PM), Dirección &amp; Docentes • Autor: Felipe (Equipo 02) • Ciclo de 18 Semanas</w:t>
             </w:r>
           </w:p>
         </w:tc>
@@ -84,7 +84,7 @@
     </w:tbl>
     <w:p>
       <w:pPr>
-        <w:spacing w:after="120"/>
+        <w:spacing w:after="80"/>
       </w:pPr>
     </w:p>
     <w:p>
@@ -97,19 +97,19 @@
           <w:rFonts w:ascii="Calibri" w:hAnsi="Calibri"/>
           <w:b/>
           <w:color w:val="0F172A"/>
-          <w:sz w:val="28"/>
+          <w:sz w:val="26"/>
         </w:rPr>
-        <w:t>1. Diagnóstico de Campo y Propuesta de Valor</w:t>
+        <w:t>1. Marco Normativo Oficial y Diagnóstico de Campo</w:t>
       </w:r>
     </w:p>
     <w:p>
       <w:r>
-        <w:t>Las entrevistas de campo con docentes del IESTP Argentina demostraron que el competidor real no es otro software, sino su archivo Excel o la hoja física de firmas. Los docentes prefieren Excel porque entran en 3 clics, ven la sábana de 18 semanas y solo marcan la letra 'F' a los ausentes.</w:t>
+        <w:t>El diseño del Módulo 02 responde a la Ley N° 30512, RVM N° 277-2019-MINEDU y al Manual de Procedimientos Académicos (MPA 2024–2026, R.D. N° 109-V-DIR-2024-IESTP."ARGENTINA").</w:t>
       </w:r>
     </w:p>
     <w:p>
       <w:r>
-        <w:t>Nuestra solución resuelve el problema superando al Excel en su propio juego mediante tres motores de entrada:</w:t>
+        <w:t>Las entrevistas de campo demostraron que el competidor real de cualquier sistema es el Excel personal o la hoja física. Nuestra solución supera al Excel mediante tres motores de registro:</w:t>
       </w:r>
     </w:p>
     <w:p>
@@ -125,7 +125,7 @@
         <w:pStyle w:val="ListBullet"/>
       </w:pPr>
       <w:r>
-        <w:t>• Motor 2 (Sábana Interactiva Live Grid): Matriz de 18 semanas con atajos de teclado (flechas, F, T, P) y cálculo automático de DPI.</w:t>
+        <w:t>• Motor 2 (Sábana Interactiva Live Grid): Matriz completa de 18 semanas con navegación por teclado (flechas, F, T, P) y cálculo automático de DPI.</w:t>
       </w:r>
     </w:p>
     <w:p>
@@ -133,7 +133,7 @@
         <w:pStyle w:val="ListBullet"/>
       </w:pPr>
       <w:r>
-        <w:t>• Motor 3 (Smart Copy-Paste Ctrl+V): El docente pega directamente una columna o tabla desde su Excel personal y sincroniza en 1 segundo.</w:t>
+        <w:t>• Motor 3 (Smart Copy-Paste Ctrl+V): El docente pega directamente su columna desde Excel y el sistema mapea por DNI en 1 segundo.</w:t>
       </w:r>
     </w:p>
     <w:p>
@@ -146,24 +146,68 @@
           <w:rFonts w:ascii="Calibri" w:hAnsi="Calibri"/>
           <w:b/>
           <w:color w:val="0F172A"/>
-          <w:sz w:val="28"/>
+          <w:sz w:val="26"/>
         </w:rPr>
-        <w:t>2. Matriz Exhaustiva de Casos de Uso por Rol</w:t>
+        <w:t>2. Diagrama de Casos de Uso por Rol (UML)</w:t>
       </w:r>
     </w:p>
     <w:p>
       <w:r>
-        <w:t>• ROL DOCENTE: CU-DOC-01 (Toma Flash 1-Clic), CU-DOC-02 (Sábana Live Grid), CU-DOC-03 (Pegar desde Excel Ctrl+V), CU-DOC-04 (Cierre y Oficialización), CU-DOC-05 (Sesión Extraordinaria/Recuperación), CU-DOC-06 (Cambio de Aula en Vivo), CU-DOC-07 (Aprobar Justificaciones en 72h).</w:t>
+        <w:t>El siguiente diagrama consolida los 18 Casos de Uso del Módulo 02, organizados por los cuatro actores institucionales:</w:t>
       </w:r>
     </w:p>
     <w:p>
+      <w:pPr>
+        <w:spacing w:before="160" w:after="40"/>
+        <w:jc w:val="center"/>
+      </w:pPr>
       <w:r>
-        <w:t>• ROL ESTUDIANTE: CU-EST-01 (Semáforo Anti-DPI y Horas de Margen), CU-EST-02 (Solicitud de Justificación Digital con Foto), CU-EST-03 (Historial Detallado).</w:t>
+        <w:drawing>
+          <wp:inline xmlns:a="http://schemas.openxmlformats.org/drawingml/2006/main" xmlns:pic="http://schemas.openxmlformats.org/drawingml/2006/picture">
+            <wp:extent cx="6217920" cy="1173791"/>
+            <wp:docPr id="1" name="Picture 1"/>
+            <wp:cNvGraphicFramePr>
+              <a:graphicFrameLocks noChangeAspect="1"/>
+            </wp:cNvGraphicFramePr>
+            <a:graphic>
+              <a:graphicData uri="http://schemas.openxmlformats.org/drawingml/2006/picture">
+                <pic:pic>
+                  <pic:nvPicPr>
+                    <pic:cNvPr id="0" name="01_diagrama_casos_de_uso_roles.png"/>
+                    <pic:cNvPicPr/>
+                  </pic:nvPicPr>
+                  <pic:blipFill>
+                    <a:blip r:embed="rId9"/>
+                    <a:stretch>
+                      <a:fillRect/>
+                    </a:stretch>
+                  </pic:blipFill>
+                  <pic:spPr>
+                    <a:xfrm>
+                      <a:off x="0" y="0"/>
+                      <a:ext cx="6217920" cy="1173791"/>
+                    </a:xfrm>
+                    <a:prstGeom prst="rect"/>
+                  </pic:spPr>
+                </pic:pic>
+              </a:graphicData>
+            </a:graphic>
+          </wp:inline>
+        </w:drawing>
       </w:r>
     </w:p>
     <w:p>
+      <w:pPr>
+        <w:spacing w:before="0" w:after="160"/>
+        <w:jc w:val="center"/>
+      </w:pPr>
       <w:r>
-        <w:t>• ROL COORDINACIÓN: CU-COORD-01 (Radar de Cumplimiento Docente en Vivo), CU-COORD-02 (Radar Preventivo de Deserción y Casos DPI), CU-COORD-03 (Reprogramar Horarios Futuros), CU-COORD-04 (Exportación Oficial en Excel .xlsx y PDF).</w:t>
+        <w:rPr>
+          <w:i/>
+          <w:color w:val="64748B"/>
+          <w:sz w:val="17"/>
+        </w:rPr>
+        <w:t>📐 Figura: Diagrama UML de Casos de Uso por Rol (Docente, Estudiante, Coordinación y Secretaría)</w:t>
       </w:r>
     </w:p>
     <w:p>
@@ -176,24 +220,231 @@
           <w:rFonts w:ascii="Calibri" w:hAnsi="Calibri"/>
           <w:b/>
           <w:color w:val="0F172A"/>
-          <w:sz w:val="28"/>
+          <w:sz w:val="26"/>
         </w:rPr>
-        <w:t>3. Diagramas de Actividades de Negocio</w:t>
+        <w:t>3. Diagramas de Actividad y Procesos de Negocio</w:t>
+      </w:r>
+    </w:p>
+    <w:p>
+      <w:pPr>
+        <w:keepNext/>
+        <w:spacing w:before="200" w:after="60"/>
+      </w:pPr>
+      <w:r>
+        <w:rPr>
+          <w:rFonts w:ascii="Calibri" w:hAnsi="Calibri"/>
+          <w:b/>
+          <w:color w:val="1D4ED8"/>
+          <w:sz w:val="22"/>
+        </w:rPr>
+        <w:t>Proceso 1: Flujo Multimodal de Toma de Asistencia Docente</w:t>
       </w:r>
     </w:p>
     <w:p>
       <w:r>
-        <w:t>• Flujo 1 (Toma de Asistencia): Docente ingresa -&gt; Selecciona Modo (Flash, Sábana o Pegar Excel) -&gt; Marca faltas -&gt; Oficializa -&gt; Transacción en mod02.asistencias y congelamiento de sesión.</w:t>
+        <w:t>Muestra la interacción desde la autodetección de aula/horario hasta la congelación inmutable de la sesión en base de datos:</w:t>
+      </w:r>
+    </w:p>
+    <w:p>
+      <w:pPr>
+        <w:spacing w:before="160" w:after="40"/>
+        <w:jc w:val="center"/>
+      </w:pPr>
+      <w:r>
+        <w:drawing>
+          <wp:inline xmlns:a="http://schemas.openxmlformats.org/drawingml/2006/main" xmlns:pic="http://schemas.openxmlformats.org/drawingml/2006/picture">
+            <wp:extent cx="5943600" cy="20471926"/>
+            <wp:docPr id="2" name="Picture 2"/>
+            <wp:cNvGraphicFramePr>
+              <a:graphicFrameLocks noChangeAspect="1"/>
+            </wp:cNvGraphicFramePr>
+            <a:graphic>
+              <a:graphicData uri="http://schemas.openxmlformats.org/drawingml/2006/picture">
+                <pic:pic>
+                  <pic:nvPicPr>
+                    <pic:cNvPr id="0" name="02_diagrama_actividad_toma_asistencia.png"/>
+                    <pic:cNvPicPr/>
+                  </pic:nvPicPr>
+                  <pic:blipFill>
+                    <a:blip r:embed="rId10"/>
+                    <a:stretch>
+                      <a:fillRect/>
+                    </a:stretch>
+                  </pic:blipFill>
+                  <pic:spPr>
+                    <a:xfrm>
+                      <a:off x="0" y="0"/>
+                      <a:ext cx="5943600" cy="20471926"/>
+                    </a:xfrm>
+                    <a:prstGeom prst="rect"/>
+                  </pic:spPr>
+                </pic:pic>
+              </a:graphicData>
+            </a:graphic>
+          </wp:inline>
+        </w:drawing>
+      </w:r>
+    </w:p>
+    <w:p>
+      <w:pPr>
+        <w:spacing w:before="0" w:after="160"/>
+        <w:jc w:val="center"/>
+      </w:pPr>
+      <w:r>
+        <w:rPr>
+          <w:i/>
+          <w:color w:val="64748B"/>
+          <w:sz w:val="17"/>
+        </w:rPr>
+        <w:t>📐 Figura: Diagrama de Actividad: Toma de Asistencia y Oficialización Inmutable</w:t>
+      </w:r>
+    </w:p>
+    <w:p>
+      <w:pPr>
+        <w:keepNext/>
+        <w:spacing w:before="200" w:after="60"/>
+      </w:pPr>
+      <w:r>
+        <w:rPr>
+          <w:rFonts w:ascii="Calibri" w:hAnsi="Calibri"/>
+          <w:b/>
+          <w:color w:val="1D4ED8"/>
+          <w:sz w:val="22"/>
+        </w:rPr>
+        <w:t>Proceso 2: Justificación Digital de Inasistencias (Ventana 72h)</w:t>
       </w:r>
     </w:p>
     <w:p>
       <w:r>
-        <w:t>• Flujo 2 (Justificación Digital): Alumno pulsa 'Justificar' -&gt; Sistema valida fecha &lt;= 72h hábiles -&gt; Sube comprobante -&gt; Docente evalúa y aprueba -&gt; Se reclasifica a FALTA_JUSTIFICADA y se actualiza el porcentaje DPI en vivo.</w:t>
+        <w:t>El estudiante tiene un plazo improrrogable de 72 horas hábiles para adjuntar sustento médico o laboral:</w:t>
+      </w:r>
+    </w:p>
+    <w:p>
+      <w:pPr>
+        <w:spacing w:before="160" w:after="40"/>
+        <w:jc w:val="center"/>
+      </w:pPr>
+      <w:r>
+        <w:drawing>
+          <wp:inline xmlns:a="http://schemas.openxmlformats.org/drawingml/2006/main" xmlns:pic="http://schemas.openxmlformats.org/drawingml/2006/picture">
+            <wp:extent cx="5943600" cy="27657263"/>
+            <wp:docPr id="3" name="Picture 3"/>
+            <wp:cNvGraphicFramePr>
+              <a:graphicFrameLocks noChangeAspect="1"/>
+            </wp:cNvGraphicFramePr>
+            <a:graphic>
+              <a:graphicData uri="http://schemas.openxmlformats.org/drawingml/2006/picture">
+                <pic:pic>
+                  <pic:nvPicPr>
+                    <pic:cNvPr id="0" name="03_diagrama_actividad_justificacion_estudiante.png"/>
+                    <pic:cNvPicPr/>
+                  </pic:nvPicPr>
+                  <pic:blipFill>
+                    <a:blip r:embed="rId11"/>
+                    <a:stretch>
+                      <a:fillRect/>
+                    </a:stretch>
+                  </pic:blipFill>
+                  <pic:spPr>
+                    <a:xfrm>
+                      <a:off x="0" y="0"/>
+                      <a:ext cx="5943600" cy="27657263"/>
+                    </a:xfrm>
+                    <a:prstGeom prst="rect"/>
+                  </pic:spPr>
+                </pic:pic>
+              </a:graphicData>
+            </a:graphic>
+          </wp:inline>
+        </w:drawing>
+      </w:r>
+    </w:p>
+    <w:p>
+      <w:pPr>
+        <w:spacing w:before="0" w:after="160"/>
+        <w:jc w:val="center"/>
+      </w:pPr>
+      <w:r>
+        <w:rPr>
+          <w:i/>
+          <w:color w:val="64748B"/>
+          <w:sz w:val="17"/>
+        </w:rPr>
+        <w:t>📐 Figura: Diagrama de Actividad: Solicitud, Validación Temporal y Aprobación de Justificación Médica</w:t>
+      </w:r>
+    </w:p>
+    <w:p>
+      <w:pPr>
+        <w:keepNext/>
+        <w:spacing w:before="200" w:after="60"/>
+      </w:pPr>
+      <w:r>
+        <w:rPr>
+          <w:rFonts w:ascii="Calibri" w:hAnsi="Calibri"/>
+          <w:b/>
+          <w:color w:val="1D4ED8"/>
+          <w:sz w:val="22"/>
+        </w:rPr>
+        <w:t>Proceso 3: Auditoría DPI, Bloqueo Semana 17 y Cierre REGISTRA (Semana 18)</w:t>
       </w:r>
     </w:p>
     <w:p>
       <w:r>
-        <w:t>• Flujo 3 (Reprogramación Futura): Coordinador cambia día/aula a partir de Semana N -&gt; Se actualizan únicamente sesiones PROGRAMADAS (Semana &gt;= N) sin alterar el historial cerrado de las semanas anteriores.</w:t>
+        <w:t>Regla legal: Estudiantes con &gt;= 30% de inasistencias quedan inhabilitados por ley para rendir examen de recuperación en Semana 17:</w:t>
+      </w:r>
+    </w:p>
+    <w:p>
+      <w:pPr>
+        <w:spacing w:before="160" w:after="40"/>
+        <w:jc w:val="center"/>
+      </w:pPr>
+      <w:r>
+        <w:drawing>
+          <wp:inline xmlns:a="http://schemas.openxmlformats.org/drawingml/2006/main" xmlns:pic="http://schemas.openxmlformats.org/drawingml/2006/picture">
+            <wp:extent cx="5943600" cy="24734851"/>
+            <wp:docPr id="4" name="Picture 4"/>
+            <wp:cNvGraphicFramePr>
+              <a:graphicFrameLocks noChangeAspect="1"/>
+            </wp:cNvGraphicFramePr>
+            <a:graphic>
+              <a:graphicData uri="http://schemas.openxmlformats.org/drawingml/2006/picture">
+                <pic:pic>
+                  <pic:nvPicPr>
+                    <pic:cNvPr id="0" name="04_diagrama_actividad_cierre_sem17_sem18_registra.png"/>
+                    <pic:cNvPicPr/>
+                  </pic:nvPicPr>
+                  <pic:blipFill>
+                    <a:blip r:embed="rId12"/>
+                    <a:stretch>
+                      <a:fillRect/>
+                    </a:stretch>
+                  </pic:blipFill>
+                  <pic:spPr>
+                    <a:xfrm>
+                      <a:off x="0" y="0"/>
+                      <a:ext cx="5943600" cy="24734851"/>
+                    </a:xfrm>
+                    <a:prstGeom prst="rect"/>
+                  </pic:spPr>
+                </pic:pic>
+              </a:graphicData>
+            </a:graphic>
+          </wp:inline>
+        </w:drawing>
+      </w:r>
+    </w:p>
+    <w:p>
+      <w:pPr>
+        <w:spacing w:before="0" w:after="160"/>
+        <w:jc w:val="center"/>
+      </w:pPr>
+      <w:r>
+        <w:rPr>
+          <w:i/>
+          <w:color w:val="64748B"/>
+          <w:sz w:val="17"/>
+        </w:rPr>
+        <w:t>📐 Figura: Diagrama de Actividad: Detección de DPI, Bloqueo Semana 17 y Cierre Oficial REGISTRA</w:t>
       </w:r>
     </w:p>
     <w:p>
@@ -206,7 +457,7 @@
           <w:rFonts w:ascii="Calibri" w:hAnsi="Calibri"/>
           <w:b/>
           <w:color w:val="0F172A"/>
-          <w:sz w:val="28"/>
+          <w:sz w:val="26"/>
         </w:rPr>
         <w:t>4. Historias de Usuario Formales (Formato Gherkin)</w:t>
       </w:r>
@@ -221,7 +472,7 @@
           <w:rFonts w:ascii="Calibri" w:hAnsi="Calibri"/>
           <w:b/>
           <w:color w:val="1D4ED8"/>
-          <w:sz w:val="24"/>
+          <w:sz w:val="22"/>
         </w:rPr>
         <w:t>👤 HU-02.1: Toma de Asistencia Flash Contextual en 1 Clic</w:t>
       </w:r>
@@ -234,12 +485,12 @@
         <w:tblLook w:firstColumn="1" w:firstRow="1" w:lastColumn="0" w:lastRow="0" w:noHBand="0" w:noVBand="1" w:val="04A0"/>
       </w:tblPr>
       <w:tblGrid>
-        <w:gridCol w:w="9936"/>
+        <w:gridCol w:w="10080"/>
       </w:tblGrid>
       <w:tr>
         <w:tc>
           <w:tcPr>
-            <w:tcW w:type="dxa" w:w="9936"/>
+            <w:tcW w:type="dxa" w:w="10080"/>
             <w:shd w:fill="F1F5F9"/>
             <w:tcMar>
               <w:top w:w="140" w:type="dxa"/>
@@ -264,7 +515,7 @@
             <w:r>
               <w:rPr>
                 <w:color w:val="334155"/>
-                <w:sz w:val="19"/>
+                <w:sz w:val="18"/>
               </w:rPr>
               <w:t>Escenario Gherkin:</w:t>
               <w:br/>
@@ -274,7 +525,7 @@
               <w:br/>
               <w:t>Entonces observa el Hero Banner '⚡ TOMAR ASISTENCIA AHORA'</w:t>
               <w:br/>
-              <w:t>Y al presionar el botón se abre la lista con 35 alumnos en PRESENTE</w:t>
+              <w:t>Y al presionar el botón se abre la lista con 41 alumnos en PRESENTE</w:t>
               <w:br/>
               <w:t>Y al tocar al alumno ausente cambia inmediatamente a FALTA_INJUSTIFICADA.</w:t>
             </w:r>
@@ -297,7 +548,7 @@
           <w:rFonts w:ascii="Calibri" w:hAnsi="Calibri"/>
           <w:b/>
           <w:color w:val="1D4ED8"/>
-          <w:sz w:val="24"/>
+          <w:sz w:val="22"/>
         </w:rPr>
         <w:t>👤 HU-02.2: Sábana Interactiva de 18 Semanas con Teclado</w:t>
       </w:r>
@@ -310,12 +561,12 @@
         <w:tblLook w:firstColumn="1" w:firstRow="1" w:lastColumn="0" w:lastRow="0" w:noHBand="0" w:noVBand="1" w:val="04A0"/>
       </w:tblPr>
       <w:tblGrid>
-        <w:gridCol w:w="9936"/>
+        <w:gridCol w:w="10080"/>
       </w:tblGrid>
       <w:tr>
         <w:tc>
           <w:tcPr>
-            <w:tcW w:type="dxa" w:w="9936"/>
+            <w:tcW w:type="dxa" w:w="10080"/>
             <w:shd w:fill="F1F5F9"/>
             <w:tcMar>
               <w:top w:w="140" w:type="dxa"/>
@@ -340,7 +591,7 @@
             <w:r>
               <w:rPr>
                 <w:color w:val="334155"/>
-                <w:sz w:val="19"/>
+                <w:sz w:val="18"/>
               </w:rPr>
               <w:t>Escenario Gherkin:</w:t>
               <w:br/>
@@ -371,7 +622,7 @@
           <w:rFonts w:ascii="Calibri" w:hAnsi="Calibri"/>
           <w:b/>
           <w:color w:val="1D4ED8"/>
-          <w:sz w:val="24"/>
+          <w:sz w:val="22"/>
         </w:rPr>
         <w:t>👤 HU-02.3: Smart Copy-Paste desde Excel Personal (Ctrl+V)</w:t>
       </w:r>
@@ -384,12 +635,12 @@
         <w:tblLook w:firstColumn="1" w:firstRow="1" w:lastColumn="0" w:lastRow="0" w:noHBand="0" w:noVBand="1" w:val="04A0"/>
       </w:tblPr>
       <w:tblGrid>
-        <w:gridCol w:w="9936"/>
+        <w:gridCol w:w="10080"/>
       </w:tblGrid>
       <w:tr>
         <w:tc>
           <w:tcPr>
-            <w:tcW w:type="dxa" w:w="9936"/>
+            <w:tcW w:type="dxa" w:w="10080"/>
             <w:shd w:fill="F1F5F9"/>
             <w:tcMar>
               <w:top w:w="140" w:type="dxa"/>
@@ -414,7 +665,7 @@
             <w:r>
               <w:rPr>
                 <w:color w:val="334155"/>
-                <w:sz w:val="19"/>
+                <w:sz w:val="18"/>
               </w:rPr>
               <w:t>Escenario Gherkin:</w:t>
               <w:br/>
@@ -422,7 +673,7 @@
               <w:br/>
               <w:t>Cuando hace clic en '📋 Pegar desde Excel' y presiona 'Ctrl+V'</w:t>
               <w:br/>
-              <w:t>Entonces el sistema valida los DNIs/nombres y rellena automáticamente las 35 celdas en 1 segundo.</w:t>
+              <w:t>Entonces el sistema valida los DNIs/nombres y rellena automáticamente las 41 celdas en 1 segundo.</w:t>
             </w:r>
           </w:p>
         </w:tc>
@@ -443,7 +694,7 @@
           <w:rFonts w:ascii="Calibri" w:hAnsi="Calibri"/>
           <w:b/>
           <w:color w:val="1D4ED8"/>
-          <w:sz w:val="24"/>
+          <w:sz w:val="22"/>
         </w:rPr>
         <w:t>👤 HU-02.4: Radar Semafórico Anti-DPI para Estudiantes</w:t>
       </w:r>
@@ -456,12 +707,12 @@
         <w:tblLook w:firstColumn="1" w:firstRow="1" w:lastColumn="0" w:lastRow="0" w:noHBand="0" w:noVBand="1" w:val="04A0"/>
       </w:tblPr>
       <w:tblGrid>
-        <w:gridCol w:w="9936"/>
+        <w:gridCol w:w="10080"/>
       </w:tblGrid>
       <w:tr>
         <w:tc>
           <w:tcPr>
-            <w:tcW w:type="dxa" w:w="9936"/>
+            <w:tcW w:type="dxa" w:w="10080"/>
             <w:shd w:fill="F1F5F9"/>
             <w:tcMar>
               <w:top w:w="140" w:type="dxa"/>
@@ -486,7 +737,7 @@
             <w:r>
               <w:rPr>
                 <w:color w:val="334155"/>
-                <w:sz w:val="19"/>
+                <w:sz w:val="18"/>
               </w:rPr>
               <w:t>Escenario Gherkin:</w:t>
               <w:br/>
@@ -508,78 +759,6 @@
     <w:p>
       <w:pPr>
         <w:keepNext/>
-        <w:spacing w:before="200" w:after="60"/>
-      </w:pPr>
-      <w:r>
-        <w:rPr>
-          <w:rFonts w:ascii="Calibri" w:hAnsi="Calibri"/>
-          <w:b/>
-          <w:color w:val="1D4ED8"/>
-          <w:sz w:val="24"/>
-        </w:rPr>
-        <w:t>👤 HU-02.5: Justificación Digital Móvil en 72 Horas</w:t>
-      </w:r>
-    </w:p>
-    <w:tbl>
-      <w:tblPr>
-        <w:tblW w:type="auto" w:w="0"/>
-        <w:jc w:val="center"/>
-        <w:tblLayout w:type="fixed"/>
-        <w:tblLook w:firstColumn="1" w:firstRow="1" w:lastColumn="0" w:lastRow="0" w:noHBand="0" w:noVBand="1" w:val="04A0"/>
-      </w:tblPr>
-      <w:tblGrid>
-        <w:gridCol w:w="9936"/>
-      </w:tblGrid>
-      <w:tr>
-        <w:tc>
-          <w:tcPr>
-            <w:tcW w:type="dxa" w:w="9936"/>
-            <w:shd w:fill="F1F5F9"/>
-            <w:tcMar>
-              <w:top w:w="140" w:type="dxa"/>
-              <w:bottom w:w="140" w:type="dxa"/>
-              <w:left w:w="180" w:type="dxa"/>
-              <w:right w:w="180" w:type="dxa"/>
-            </w:tcMar>
-          </w:tcPr>
-          <w:p>
-            <w:pPr>
-              <w:spacing w:before="40" w:after="40"/>
-            </w:pPr>
-            <w:r>
-              <w:rPr>
-                <w:b/>
-                <w:color w:val="1E3A8A"/>
-                <w:sz w:val="19"/>
-              </w:rPr>
-              <w:t>📋 CRITERIO DE ACEPTACIÓN GHERKIN</w:t>
-              <w:br/>
-            </w:r>
-            <w:r>
-              <w:rPr>
-                <w:color w:val="334155"/>
-                <w:sz w:val="19"/>
-              </w:rPr>
-              <w:t>Escenario Gherkin:</w:t>
-              <w:br/>
-              <w:t>Dado que la inasistencia fue hace menos de 72 horas hábiles</w:t>
-              <w:br/>
-              <w:t>Cuando el alumno pulsa '📎 Justificar Falta' y sube la foto de su certificado</w:t>
-              <w:br/>
-              <w:t>Entonces queda registrada con estado PENDIENTE en la bandeja del docente titular.</w:t>
-            </w:r>
-          </w:p>
-        </w:tc>
-      </w:tr>
-    </w:tbl>
-    <w:p>
-      <w:pPr>
-        <w:spacing w:after="80"/>
-      </w:pPr>
-    </w:p>
-    <w:p>
-      <w:pPr>
-        <w:keepNext/>
         <w:spacing w:before="280" w:after="80"/>
       </w:pPr>
       <w:r>
@@ -587,7 +766,7 @@
           <w:rFonts w:ascii="Calibri" w:hAnsi="Calibri"/>
           <w:b/>
           <w:color w:val="0F172A"/>
-          <w:sz w:val="28"/>
+          <w:sz w:val="26"/>
         </w:rPr>
         <w:t>5. Matriz MoSCoW de Priorización</w:t>
       </w:r>
@@ -600,14 +779,14 @@
         <w:tblLook w:firstColumn="1" w:firstRow="1" w:lastColumn="0" w:lastRow="0" w:noHBand="0" w:noVBand="1" w:val="04A0"/>
       </w:tblPr>
       <w:tblGrid>
-        <w:gridCol w:w="3312"/>
-        <w:gridCol w:w="3312"/>
-        <w:gridCol w:w="3312"/>
+        <w:gridCol w:w="3360"/>
+        <w:gridCol w:w="3360"/>
+        <w:gridCol w:w="3360"/>
       </w:tblGrid>
       <w:tr>
         <w:tc>
           <w:tcPr>
-            <w:tcW w:type="dxa" w:w="3312"/>
+            <w:tcW w:type="dxa" w:w="3360"/>
             <w:shd w:fill="1E293B"/>
             <w:tcMar>
               <w:top w:w="100" w:type="dxa"/>
@@ -624,7 +803,7 @@
               <w:rPr>
                 <w:b/>
                 <w:color w:val="FFFFFF"/>
-                <w:sz w:val="18"/>
+                <w:sz w:val="17"/>
               </w:rPr>
               <w:t>Prioridad</w:t>
             </w:r>
@@ -632,7 +811,7 @@
         </w:tc>
         <w:tc>
           <w:tcPr>
-            <w:tcW w:type="dxa" w:w="3312"/>
+            <w:tcW w:type="dxa" w:w="3360"/>
             <w:shd w:fill="1E293B"/>
             <w:tcMar>
               <w:top w:w="100" w:type="dxa"/>
@@ -649,7 +828,7 @@
               <w:rPr>
                 <w:b/>
                 <w:color w:val="FFFFFF"/>
-                <w:sz w:val="18"/>
+                <w:sz w:val="17"/>
               </w:rPr>
               <w:t>Historias de Usuario</w:t>
             </w:r>
@@ -657,7 +836,7 @@
         </w:tc>
         <w:tc>
           <w:tcPr>
-            <w:tcW w:type="dxa" w:w="3312"/>
+            <w:tcW w:type="dxa" w:w="3360"/>
             <w:shd w:fill="1E293B"/>
             <w:tcMar>
               <w:top w:w="100" w:type="dxa"/>
@@ -674,7 +853,7 @@
               <w:rPr>
                 <w:b/>
                 <w:color w:val="FFFFFF"/>
-                <w:sz w:val="18"/>
+                <w:sz w:val="17"/>
               </w:rPr>
               <w:t>Justificación de Negocio</w:t>
             </w:r>
@@ -684,7 +863,7 @@
       <w:tr>
         <w:tc>
           <w:tcPr>
-            <w:tcW w:type="dxa" w:w="3312"/>
+            <w:tcW w:type="dxa" w:w="3360"/>
             <w:shd w:fill="FFFFFF"/>
             <w:tcMar>
               <w:top w:w="80" w:type="dxa"/>
@@ -700,7 +879,7 @@
             <w:r>
               <w:rPr>
                 <w:color w:val="1E293B"/>
-                <w:sz w:val="18"/>
+                <w:sz w:val="17"/>
               </w:rPr>
               <w:t>Must Have (Obligatorio)</w:t>
             </w:r>
@@ -708,7 +887,7 @@
         </w:tc>
         <w:tc>
           <w:tcPr>
-            <w:tcW w:type="dxa" w:w="3312"/>
+            <w:tcW w:type="dxa" w:w="3360"/>
             <w:shd w:fill="FFFFFF"/>
             <w:tcMar>
               <w:top w:w="80" w:type="dxa"/>
@@ -724,15 +903,15 @@
             <w:r>
               <w:rPr>
                 <w:color w:val="1E293B"/>
-                <w:sz w:val="18"/>
+                <w:sz w:val="17"/>
               </w:rPr>
-              <w:t>HU-02.1 (Flash 1-Clic), HU-02.2 (Sábana Teclado), HU-02.3 (Copy-Paste), HU-02.4 (Semáforo), HU-02.5 (Justif 72h)</w:t>
+              <w:t>HU-02.1 (Flash 1-Clic), HU-02.2 (Sábana 18 Semanas), HU-02.3 (Copy-Paste Ctrl+V), HU-02.4 (Semáforo Anti-DPI), HU-02.5 (Justif 72h)</w:t>
             </w:r>
           </w:p>
         </w:tc>
         <w:tc>
           <w:tcPr>
-            <w:tcW w:type="dxa" w:w="3312"/>
+            <w:tcW w:type="dxa" w:w="3360"/>
             <w:shd w:fill="FFFFFF"/>
             <w:tcMar>
               <w:top w:w="80" w:type="dxa"/>
@@ -748,9 +927,9 @@
             <w:r>
               <w:rPr>
                 <w:color w:val="1E293B"/>
-                <w:sz w:val="18"/>
+                <w:sz w:val="17"/>
               </w:rPr>
-              <w:t>Garantiza la adopción total superando al Excel en velocidad y eliminando el doble trabajo.</w:t>
+              <w:t>Garantiza adopción total eliminando el doble trabajo.</w:t>
             </w:r>
           </w:p>
         </w:tc>
@@ -758,7 +937,7 @@
       <w:tr>
         <w:tc>
           <w:tcPr>
-            <w:tcW w:type="dxa" w:w="3312"/>
+            <w:tcW w:type="dxa" w:w="3360"/>
             <w:shd w:fill="F8FAFC"/>
             <w:tcMar>
               <w:top w:w="80" w:type="dxa"/>
@@ -774,7 +953,7 @@
             <w:r>
               <w:rPr>
                 <w:color w:val="1E293B"/>
-                <w:sz w:val="18"/>
+                <w:sz w:val="17"/>
               </w:rPr>
               <w:t>Should Have (Importante)</w:t>
             </w:r>
@@ -782,7 +961,7 @@
         </w:tc>
         <w:tc>
           <w:tcPr>
-            <w:tcW w:type="dxa" w:w="3312"/>
+            <w:tcW w:type="dxa" w:w="3360"/>
             <w:shd w:fill="F8FAFC"/>
             <w:tcMar>
               <w:top w:w="80" w:type="dxa"/>
@@ -798,15 +977,15 @@
             <w:r>
               <w:rPr>
                 <w:color w:val="1E293B"/>
-                <w:sz w:val="18"/>
+                <w:sz w:val="17"/>
               </w:rPr>
-              <w:t>HU-02.6 (Recuperación Ad-hoc), HU-02.7 (Reprogramación Futura), HU-02.8 (Reportes DPI)</w:t>
+              <w:t>HU-02.6 (Semana 17 Recuperación), HU-02.7 (Reprogramación Futura), HU-02.8 (Exportación REGISTRA MINEDU .xlsx)</w:t>
             </w:r>
           </w:p>
         </w:tc>
         <w:tc>
           <w:tcPr>
-            <w:tcW w:type="dxa" w:w="3312"/>
+            <w:tcW w:type="dxa" w:w="3360"/>
             <w:shd w:fill="F8FAFC"/>
             <w:tcMar>
               <w:top w:w="80" w:type="dxa"/>
@@ -822,9 +1001,9 @@
             <w:r>
               <w:rPr>
                 <w:color w:val="1E293B"/>
-                <w:sz w:val="18"/>
+                <w:sz w:val="17"/>
               </w:rPr>
-              <w:t>Resiliencia ante cambios de horarios y reportería oficial.</w:t>
+              <w:t>Cumplimiento normativo y auditoría oficial.</w:t>
             </w:r>
           </w:p>
         </w:tc>
@@ -832,7 +1011,7 @@
       <w:tr>
         <w:tc>
           <w:tcPr>
-            <w:tcW w:type="dxa" w:w="3312"/>
+            <w:tcW w:type="dxa" w:w="3360"/>
             <w:shd w:fill="FFFFFF"/>
             <w:tcMar>
               <w:top w:w="80" w:type="dxa"/>
@@ -848,7 +1027,7 @@
             <w:r>
               <w:rPr>
                 <w:color w:val="1E293B"/>
-                <w:sz w:val="18"/>
+                <w:sz w:val="17"/>
               </w:rPr>
               <w:t>Could Have (Deseable)</w:t>
             </w:r>
@@ -856,7 +1035,7 @@
         </w:tc>
         <w:tc>
           <w:tcPr>
-            <w:tcW w:type="dxa" w:w="3312"/>
+            <w:tcW w:type="dxa" w:w="3360"/>
             <w:shd w:fill="FFFFFF"/>
             <w:tcMar>
               <w:top w:w="80" w:type="dxa"/>
@@ -872,15 +1051,15 @@
             <w:r>
               <w:rPr>
                 <w:color w:val="1E293B"/>
-                <w:sz w:val="18"/>
+                <w:sz w:val="17"/>
               </w:rPr>
-              <w:t>Descarga de plantilla personalizada .xlsx, selector de cambio de aula.</w:t>
+              <w:t>Reubicación de aula en vivo, atajos táctiles móviles.</w:t>
             </w:r>
           </w:p>
         </w:tc>
         <w:tc>
           <w:tcPr>
-            <w:tcW w:type="dxa" w:w="3312"/>
+            <w:tcW w:type="dxa" w:w="3360"/>
             <w:shd w:fill="FFFFFF"/>
             <w:tcMar>
               <w:top w:w="80" w:type="dxa"/>
@@ -896,9 +1075,9 @@
             <w:r>
               <w:rPr>
                 <w:color w:val="1E293B"/>
-                <w:sz w:val="18"/>
+                <w:sz w:val="17"/>
               </w:rPr>
-              <w:t>Comodidad visual y soporte para laboratorios ocupados.</w:t>
+              <w:t>Comodidad operativa para laboratorios llenos.</w:t>
             </w:r>
           </w:p>
         </w:tc>
@@ -906,7 +1085,7 @@
       <w:tr>
         <w:tc>
           <w:tcPr>
-            <w:tcW w:type="dxa" w:w="3312"/>
+            <w:tcW w:type="dxa" w:w="3360"/>
             <w:shd w:fill="F8FAFC"/>
             <w:tcMar>
               <w:top w:w="80" w:type="dxa"/>
@@ -922,7 +1101,7 @@
             <w:r>
               <w:rPr>
                 <w:color w:val="1E293B"/>
-                <w:sz w:val="18"/>
+                <w:sz w:val="17"/>
               </w:rPr>
               <w:t>Won't Have (Descartado)</w:t>
             </w:r>
@@ -930,7 +1109,7 @@
         </w:tc>
         <w:tc>
           <w:tcPr>
-            <w:tcW w:type="dxa" w:w="3312"/>
+            <w:tcW w:type="dxa" w:w="3360"/>
             <w:shd w:fill="F8FAFC"/>
             <w:tcMar>
               <w:top w:w="80" w:type="dxa"/>
@@ -946,15 +1125,15 @@
             <w:r>
               <w:rPr>
                 <w:color w:val="1E293B"/>
-                <w:sz w:val="18"/>
+                <w:sz w:val="17"/>
               </w:rPr>
-              <w:t>Reconocimiento biométrico facial.</w:t>
+              <w:t>Reconocimiento facial biométrico.</w:t>
             </w:r>
           </w:p>
         </w:tc>
         <w:tc>
           <w:tcPr>
-            <w:tcW w:type="dxa" w:w="3312"/>
+            <w:tcW w:type="dxa" w:w="3360"/>
             <w:shd w:fill="F8FAFC"/>
             <w:tcMar>
               <w:top w:w="80" w:type="dxa"/>
@@ -970,9 +1149,9 @@
             <w:r>
               <w:rPr>
                 <w:color w:val="1E293B"/>
-                <w:sz w:val="18"/>
+                <w:sz w:val="17"/>
               </w:rPr>
-              <w:t>Fuera del alcance.</w:t>
+              <w:t>Fuera de alcance y costo excesivo de hardware.</w:t>
             </w:r>
           </w:p>
         </w:tc>
@@ -985,7 +1164,7 @@
     </w:p>
     <w:sectPr>
       <w:pgSz w:w="12240" w:h="15840"/>
-      <w:pgMar w:top="1152" w:right="1152" w:bottom="1152" w:left="1152" w:header="720" w:footer="720" w:gutter="0"/>
+      <w:pgMar w:top="1080" w:right="1080" w:bottom="1080" w:left="1080" w:header="720" w:footer="720" w:gutter="0"/>
       <w:cols w:space="720"/>
       <w:docGrid w:linePitch="360"/>
     </w:sectPr>
@@ -1359,7 +1538,7 @@
     <w:rPr>
       <w:rFonts w:ascii="Calibri" w:hAnsi="Calibri"/>
       <w:color w:val="334155"/>
-      <w:sz w:val="21"/>
+      <w:sz w:val="20"/>
     </w:rPr>
   </w:style>
   <w:style w:type="paragraph" w:styleId="Header">

</xml_diff>

<commit_message>
docs(mod02): agregar diagramas UML especificos para rol Docente y Estudiante
</commit_message>
<xml_diff>
--- a/src/02_Modulos/Intranet.Modulo02/Docs/01_DOCUMENTO_PRODUCTO_Y_HISTORIAS_USUARIO_PM.docx
+++ b/src/02_Modulos/Intranet.Modulo02/Docs/01_DOCUMENTO_PRODUCTO_Y_HISTORIAS_USUARIO_PM.docx
@@ -148,12 +148,32 @@
           <w:color w:val="0F172A"/>
           <w:sz w:val="26"/>
         </w:rPr>
-        <w:t>2. Diagrama de Casos de Uso por Rol (UML)</w:t>
+        <w:t>2. Diagramas de Casos de Uso por Rol (UML)</w:t>
       </w:r>
     </w:p>
     <w:p>
       <w:r>
-        <w:t>El siguiente diagrama consolida los 18 Casos de Uso del Módulo 02, organizados por los cuatro actores institucionales:</w:t>
+        <w:t>La arquitectura funcional del Módulo 02 se centra en los dos roles protagónicos del aula: el Docente y el Estudiante:</w:t>
+      </w:r>
+    </w:p>
+    <w:p>
+      <w:pPr>
+        <w:keepNext/>
+        <w:spacing w:before="200" w:after="60"/>
+      </w:pPr>
+      <w:r>
+        <w:rPr>
+          <w:rFonts w:ascii="Calibri" w:hAnsi="Calibri"/>
+          <w:b/>
+          <w:color w:val="1D4ED8"/>
+          <w:sz w:val="22"/>
+        </w:rPr>
+        <w:t>2.1. Casos de Uso del Rol Docente (CU-DOC-01 al CU-DOC-08)</w:t>
+      </w:r>
+    </w:p>
+    <w:p>
+      <w:r>
+        <w:t>Muestra la interacción del docente en los tres motores de asistencia (Flash, Sábana y Copy-Paste), evaluación de justificaciones y cierre inmutable:</w:t>
       </w:r>
     </w:p>
     <w:p>
@@ -164,7 +184,7 @@
       <w:r>
         <w:drawing>
           <wp:inline xmlns:a="http://schemas.openxmlformats.org/drawingml/2006/main" xmlns:pic="http://schemas.openxmlformats.org/drawingml/2006/picture">
-            <wp:extent cx="6217920" cy="1173791"/>
+            <wp:extent cx="6217920" cy="15502114"/>
             <wp:docPr id="1" name="Picture 1"/>
             <wp:cNvGraphicFramePr>
               <a:graphicFrameLocks noChangeAspect="1"/>
@@ -173,7 +193,7 @@
               <a:graphicData uri="http://schemas.openxmlformats.org/drawingml/2006/picture">
                 <pic:pic>
                   <pic:nvPicPr>
-                    <pic:cNvPr id="0" name="01_diagrama_casos_de_uso_roles.png"/>
+                    <pic:cNvPr id="0" name="01_diagrama_casos_de_uso_docente.png"/>
                     <pic:cNvPicPr/>
                   </pic:nvPicPr>
                   <pic:blipFill>
@@ -185,7 +205,7 @@
                   <pic:spPr>
                     <a:xfrm>
                       <a:off x="0" y="0"/>
-                      <a:ext cx="6217920" cy="1173791"/>
+                      <a:ext cx="6217920" cy="15502114"/>
                     </a:xfrm>
                     <a:prstGeom prst="rect"/>
                   </pic:spPr>
@@ -207,7 +227,155 @@
           <w:color w:val="64748B"/>
           <w:sz w:val="17"/>
         </w:rPr>
-        <w:t>📐 Figura: Diagrama UML de Casos de Uso por Rol (Docente, Estudiante, Coordinación y Secretaría)</w:t>
+        <w:t>📐 Figura: Diagrama de Casos de Uso UML: Rol Docente (Toma Flash, Sábana 18 Semanas, Copy-Paste y Justificaciones)</w:t>
+      </w:r>
+    </w:p>
+    <w:p>
+      <w:pPr>
+        <w:keepNext/>
+        <w:spacing w:before="200" w:after="60"/>
+      </w:pPr>
+      <w:r>
+        <w:rPr>
+          <w:rFonts w:ascii="Calibri" w:hAnsi="Calibri"/>
+          <w:b/>
+          <w:color w:val="1D4ED8"/>
+          <w:sz w:val="22"/>
+        </w:rPr>
+        <w:t>2.2. Casos de Uso del Rol Estudiante (CU-EST-01 al CU-EST-05)</w:t>
+      </w:r>
+    </w:p>
+    <w:p>
+      <w:r>
+        <w:t>Muestra la experiencia del alumno en su Portal Anti-DPI (/MiAsistencia), cálculo de horas restantes de inasistencia y justificación médica en 72 horas:</w:t>
+      </w:r>
+    </w:p>
+    <w:p>
+      <w:pPr>
+        <w:spacing w:before="160" w:after="40"/>
+        <w:jc w:val="center"/>
+      </w:pPr>
+      <w:r>
+        <w:drawing>
+          <wp:inline xmlns:a="http://schemas.openxmlformats.org/drawingml/2006/main" xmlns:pic="http://schemas.openxmlformats.org/drawingml/2006/picture">
+            <wp:extent cx="6217920" cy="11168957"/>
+            <wp:docPr id="2" name="Picture 2"/>
+            <wp:cNvGraphicFramePr>
+              <a:graphicFrameLocks noChangeAspect="1"/>
+            </wp:cNvGraphicFramePr>
+            <a:graphic>
+              <a:graphicData uri="http://schemas.openxmlformats.org/drawingml/2006/picture">
+                <pic:pic>
+                  <pic:nvPicPr>
+                    <pic:cNvPr id="0" name="01_diagrama_casos_de_uso_estudiante.png"/>
+                    <pic:cNvPicPr/>
+                  </pic:nvPicPr>
+                  <pic:blipFill>
+                    <a:blip r:embed="rId10"/>
+                    <a:stretch>
+                      <a:fillRect/>
+                    </a:stretch>
+                  </pic:blipFill>
+                  <pic:spPr>
+                    <a:xfrm>
+                      <a:off x="0" y="0"/>
+                      <a:ext cx="6217920" cy="11168957"/>
+                    </a:xfrm>
+                    <a:prstGeom prst="rect"/>
+                  </pic:spPr>
+                </pic:pic>
+              </a:graphicData>
+            </a:graphic>
+          </wp:inline>
+        </w:drawing>
+      </w:r>
+    </w:p>
+    <w:p>
+      <w:pPr>
+        <w:spacing w:before="0" w:after="160"/>
+        <w:jc w:val="center"/>
+      </w:pPr>
+      <w:r>
+        <w:rPr>
+          <w:i/>
+          <w:color w:val="64748B"/>
+          <w:sz w:val="17"/>
+        </w:rPr>
+        <w:t>📐 Figura: Diagrama de Casos de Uso UML: Rol Estudiante (Portal Anti-DPI, Monitor de Horas y Justificación Digital)</w:t>
+      </w:r>
+    </w:p>
+    <w:p>
+      <w:pPr>
+        <w:keepNext/>
+        <w:spacing w:before="200" w:after="60"/>
+      </w:pPr>
+      <w:r>
+        <w:rPr>
+          <w:rFonts w:ascii="Calibri" w:hAnsi="Calibri"/>
+          <w:b/>
+          <w:color w:val="1D4ED8"/>
+          <w:sz w:val="22"/>
+        </w:rPr>
+        <w:t>2.3. Interacción Dual Docente - Estudiante</w:t>
+      </w:r>
+    </w:p>
+    <w:p>
+      <w:r>
+        <w:t>Consolidado de la interacción operativa entre la toma de asistencia del docente y la prevención de deserción del estudiante:</w:t>
+      </w:r>
+    </w:p>
+    <w:p>
+      <w:pPr>
+        <w:spacing w:before="160" w:after="40"/>
+        <w:jc w:val="center"/>
+      </w:pPr>
+      <w:r>
+        <w:drawing>
+          <wp:inline xmlns:a="http://schemas.openxmlformats.org/drawingml/2006/main" xmlns:pic="http://schemas.openxmlformats.org/drawingml/2006/picture">
+            <wp:extent cx="6217920" cy="8257778"/>
+            <wp:docPr id="3" name="Picture 3"/>
+            <wp:cNvGraphicFramePr>
+              <a:graphicFrameLocks noChangeAspect="1"/>
+            </wp:cNvGraphicFramePr>
+            <a:graphic>
+              <a:graphicData uri="http://schemas.openxmlformats.org/drawingml/2006/picture">
+                <pic:pic>
+                  <pic:nvPicPr>
+                    <pic:cNvPr id="0" name="01_diagrama_casos_de_uso_docente_estudiante_dual.png"/>
+                    <pic:cNvPicPr/>
+                  </pic:nvPicPr>
+                  <pic:blipFill>
+                    <a:blip r:embed="rId11"/>
+                    <a:stretch>
+                      <a:fillRect/>
+                    </a:stretch>
+                  </pic:blipFill>
+                  <pic:spPr>
+                    <a:xfrm>
+                      <a:off x="0" y="0"/>
+                      <a:ext cx="6217920" cy="8257778"/>
+                    </a:xfrm>
+                    <a:prstGeom prst="rect"/>
+                  </pic:spPr>
+                </pic:pic>
+              </a:graphicData>
+            </a:graphic>
+          </wp:inline>
+        </w:drawing>
+      </w:r>
+    </w:p>
+    <w:p>
+      <w:pPr>
+        <w:spacing w:before="0" w:after="160"/>
+        <w:jc w:val="center"/>
+      </w:pPr>
+      <w:r>
+        <w:rPr>
+          <w:i/>
+          <w:color w:val="64748B"/>
+          <w:sz w:val="17"/>
+        </w:rPr>
+        <w:t>📐 Figura: Diagrama de Interacción Operativa: Docente vs. Estudiante</w:t>
       </w:r>
     </w:p>
     <w:p>
@@ -254,7 +422,7 @@
         <w:drawing>
           <wp:inline xmlns:a="http://schemas.openxmlformats.org/drawingml/2006/main" xmlns:pic="http://schemas.openxmlformats.org/drawingml/2006/picture">
             <wp:extent cx="5943600" cy="20471926"/>
-            <wp:docPr id="2" name="Picture 2"/>
+            <wp:docPr id="4" name="Picture 4"/>
             <wp:cNvGraphicFramePr>
               <a:graphicFrameLocks noChangeAspect="1"/>
             </wp:cNvGraphicFramePr>
@@ -266,7 +434,7 @@
                     <pic:cNvPicPr/>
                   </pic:nvPicPr>
                   <pic:blipFill>
-                    <a:blip r:embed="rId10"/>
+                    <a:blip r:embed="rId12"/>
                     <a:stretch>
                       <a:fillRect/>
                     </a:stretch>
@@ -328,7 +496,7 @@
         <w:drawing>
           <wp:inline xmlns:a="http://schemas.openxmlformats.org/drawingml/2006/main" xmlns:pic="http://schemas.openxmlformats.org/drawingml/2006/picture">
             <wp:extent cx="5943600" cy="27657263"/>
-            <wp:docPr id="3" name="Picture 3"/>
+            <wp:docPr id="5" name="Picture 5"/>
             <wp:cNvGraphicFramePr>
               <a:graphicFrameLocks noChangeAspect="1"/>
             </wp:cNvGraphicFramePr>
@@ -340,7 +508,7 @@
                     <pic:cNvPicPr/>
                   </pic:nvPicPr>
                   <pic:blipFill>
-                    <a:blip r:embed="rId11"/>
+                    <a:blip r:embed="rId13"/>
                     <a:stretch>
                       <a:fillRect/>
                     </a:stretch>
@@ -402,7 +570,7 @@
         <w:drawing>
           <wp:inline xmlns:a="http://schemas.openxmlformats.org/drawingml/2006/main" xmlns:pic="http://schemas.openxmlformats.org/drawingml/2006/picture">
             <wp:extent cx="5943600" cy="24734851"/>
-            <wp:docPr id="4" name="Picture 4"/>
+            <wp:docPr id="6" name="Picture 6"/>
             <wp:cNvGraphicFramePr>
               <a:graphicFrameLocks noChangeAspect="1"/>
             </wp:cNvGraphicFramePr>
@@ -414,7 +582,7 @@
                     <pic:cNvPicPr/>
                   </pic:nvPicPr>
                   <pic:blipFill>
-                    <a:blip r:embed="rId12"/>
+                    <a:blip r:embed="rId14"/>
                     <a:stretch>
                       <a:fillRect/>
                     </a:stretch>

</xml_diff>

<commit_message>
docs(mod02): optimizar relacion de aspecto y escalado proporcional de diagramas para evitar cortes en Word y Markdown
</commit_message>
<xml_diff>
--- a/src/02_Modulos/Intranet.Modulo02/Docs/01_DOCUMENTO_PRODUCTO_Y_HISTORIAS_USUARIO_PM.docx
+++ b/src/02_Modulos/Intranet.Modulo02/Docs/01_DOCUMENTO_PRODUCTO_Y_HISTORIAS_USUARIO_PM.docx
@@ -178,13 +178,14 @@
     </w:p>
     <w:p>
       <w:pPr>
+        <w:keepNext/>
         <w:spacing w:before="160" w:after="40"/>
         <w:jc w:val="center"/>
       </w:pPr>
       <w:r>
         <w:drawing>
           <wp:inline xmlns:a="http://schemas.openxmlformats.org/drawingml/2006/main" xmlns:pic="http://schemas.openxmlformats.org/drawingml/2006/picture">
-            <wp:extent cx="6217920" cy="15502114"/>
+            <wp:extent cx="6217920" cy="1230894"/>
             <wp:docPr id="1" name="Picture 1"/>
             <wp:cNvGraphicFramePr>
               <a:graphicFrameLocks noChangeAspect="1"/>
@@ -205,7 +206,7 @@
                   <pic:spPr>
                     <a:xfrm>
                       <a:off x="0" y="0"/>
-                      <a:ext cx="6217920" cy="15502114"/>
+                      <a:ext cx="6217920" cy="1230894"/>
                     </a:xfrm>
                     <a:prstGeom prst="rect"/>
                   </pic:spPr>
@@ -252,13 +253,14 @@
     </w:p>
     <w:p>
       <w:pPr>
+        <w:keepNext/>
         <w:spacing w:before="160" w:after="40"/>
         <w:jc w:val="center"/>
       </w:pPr>
       <w:r>
         <w:drawing>
           <wp:inline xmlns:a="http://schemas.openxmlformats.org/drawingml/2006/main" xmlns:pic="http://schemas.openxmlformats.org/drawingml/2006/picture">
-            <wp:extent cx="6217920" cy="11168957"/>
+            <wp:extent cx="6217920" cy="1817790"/>
             <wp:docPr id="2" name="Picture 2"/>
             <wp:cNvGraphicFramePr>
               <a:graphicFrameLocks noChangeAspect="1"/>
@@ -279,7 +281,7 @@
                   <pic:spPr>
                     <a:xfrm>
                       <a:off x="0" y="0"/>
-                      <a:ext cx="6217920" cy="11168957"/>
+                      <a:ext cx="6217920" cy="1817790"/>
                     </a:xfrm>
                     <a:prstGeom prst="rect"/>
                   </pic:spPr>
@@ -326,13 +328,14 @@
     </w:p>
     <w:p>
       <w:pPr>
+        <w:keepNext/>
         <w:spacing w:before="160" w:after="40"/>
         <w:jc w:val="center"/>
       </w:pPr>
       <w:r>
         <w:drawing>
           <wp:inline xmlns:a="http://schemas.openxmlformats.org/drawingml/2006/main" xmlns:pic="http://schemas.openxmlformats.org/drawingml/2006/picture">
-            <wp:extent cx="6217920" cy="8257778"/>
+            <wp:extent cx="6217920" cy="1452963"/>
             <wp:docPr id="3" name="Picture 3"/>
             <wp:cNvGraphicFramePr>
               <a:graphicFrameLocks noChangeAspect="1"/>
@@ -353,7 +356,7 @@
                   <pic:spPr>
                     <a:xfrm>
                       <a:off x="0" y="0"/>
-                      <a:ext cx="6217920" cy="8257778"/>
+                      <a:ext cx="6217920" cy="1452963"/>
                     </a:xfrm>
                     <a:prstGeom prst="rect"/>
                   </pic:spPr>
@@ -415,13 +418,14 @@
     </w:p>
     <w:p>
       <w:pPr>
+        <w:keepNext/>
         <w:spacing w:before="160" w:after="40"/>
         <w:jc w:val="center"/>
       </w:pPr>
       <w:r>
         <w:drawing>
           <wp:inline xmlns:a="http://schemas.openxmlformats.org/drawingml/2006/main" xmlns:pic="http://schemas.openxmlformats.org/drawingml/2006/picture">
-            <wp:extent cx="5943600" cy="20471926"/>
+            <wp:extent cx="5943600" cy="1115941"/>
             <wp:docPr id="4" name="Picture 4"/>
             <wp:cNvGraphicFramePr>
               <a:graphicFrameLocks noChangeAspect="1"/>
@@ -442,7 +446,7 @@
                   <pic:spPr>
                     <a:xfrm>
                       <a:off x="0" y="0"/>
-                      <a:ext cx="5943600" cy="20471926"/>
+                      <a:ext cx="5943600" cy="1115941"/>
                     </a:xfrm>
                     <a:prstGeom prst="rect"/>
                   </pic:spPr>
@@ -489,13 +493,14 @@
     </w:p>
     <w:p>
       <w:pPr>
+        <w:keepNext/>
         <w:spacing w:before="160" w:after="40"/>
         <w:jc w:val="center"/>
       </w:pPr>
       <w:r>
         <w:drawing>
           <wp:inline xmlns:a="http://schemas.openxmlformats.org/drawingml/2006/main" xmlns:pic="http://schemas.openxmlformats.org/drawingml/2006/picture">
-            <wp:extent cx="5943600" cy="27657263"/>
+            <wp:extent cx="5943600" cy="697463"/>
             <wp:docPr id="5" name="Picture 5"/>
             <wp:cNvGraphicFramePr>
               <a:graphicFrameLocks noChangeAspect="1"/>
@@ -516,7 +521,7 @@
                   <pic:spPr>
                     <a:xfrm>
                       <a:off x="0" y="0"/>
-                      <a:ext cx="5943600" cy="27657263"/>
+                      <a:ext cx="5943600" cy="697463"/>
                     </a:xfrm>
                     <a:prstGeom prst="rect"/>
                   </pic:spPr>
@@ -563,13 +568,14 @@
     </w:p>
     <w:p>
       <w:pPr>
+        <w:keepNext/>
         <w:spacing w:before="160" w:after="40"/>
         <w:jc w:val="center"/>
       </w:pPr>
       <w:r>
         <w:drawing>
           <wp:inline xmlns:a="http://schemas.openxmlformats.org/drawingml/2006/main" xmlns:pic="http://schemas.openxmlformats.org/drawingml/2006/picture">
-            <wp:extent cx="5943600" cy="24734851"/>
+            <wp:extent cx="5943600" cy="1191752"/>
             <wp:docPr id="6" name="Picture 6"/>
             <wp:cNvGraphicFramePr>
               <a:graphicFrameLocks noChangeAspect="1"/>
@@ -590,7 +596,7 @@
                   <pic:spPr>
                     <a:xfrm>
                       <a:off x="0" y="0"/>
-                      <a:ext cx="5943600" cy="24734851"/>
+                      <a:ext cx="5943600" cy="1191752"/>
                     </a:xfrm>
                     <a:prstGeom prst="rect"/>
                   </pic:spPr>

</xml_diff>